<commit_message>
feat: Informe Trabajo final semana 2
</commit_message>
<xml_diff>
--- a/Semana 2/Informe Ejecutivo.docx
+++ b/Semana 2/Informe Ejecutivo.docx
@@ -1,6 +1,6 @@
 
 <file path=word/document.xml><?xml version="1.0" encoding="utf-8"?>
-<w:document xmlns:wpc="http://schemas.microsoft.com/office/word/2010/wordprocessingCanvas" xmlns:cx="http://schemas.microsoft.com/office/drawing/2014/chartex" xmlns:cx1="http://schemas.microsoft.com/office/drawing/2015/9/8/chartex" xmlns:cx2="http://schemas.microsoft.com/office/drawing/2015/10/21/chartex" xmlns:cx3="http://schemas.microsoft.com/office/drawing/2016/5/9/chartex" xmlns:cx4="http://schemas.microsoft.com/office/drawing/2016/5/10/chartex" xmlns:cx5="http://schemas.microsoft.com/office/drawing/2016/5/11/chartex" xmlns:cx6="http://schemas.microsoft.com/office/drawing/2016/5/12/chartex" xmlns:cx7="http://schemas.microsoft.com/office/drawing/2016/5/13/chartex" xmlns:cx8="http://schemas.microsoft.com/office/drawing/2016/5/14/chartex" xmlns:mc="http://schemas.openxmlformats.org/markup-compatibility/2006" xmlns:aink="http://schemas.microsoft.com/office/drawing/2016/ink" xmlns:am3d="http://schemas.microsoft.com/office/drawing/2017/model3d" xmlns:o="urn:schemas-microsoft-com:office:office" xmlns:oel="http://schemas.microsoft.com/office/2019/extlst" xmlns:r="http://schemas.openxmlformats.org/officeDocument/2006/relationships" xmlns:m="http://schemas.openxmlformats.org/officeDocument/2006/math" xmlns:v="urn:schemas-microsoft-com:vml" xmlns:wp14="http://schemas.microsoft.com/office/word/2010/wordprocessingDrawing" xmlns:wp="http://schemas.openxmlformats.org/drawingml/2006/wordprocessingDrawing" xmlns:w10="urn:schemas-microsoft-com:office:word" xmlns:w="http://schemas.openxmlformats.org/wordprocessingml/2006/main" xmlns:w14="http://schemas.microsoft.com/office/word/2010/wordml" xmlns:w15="http://schemas.microsoft.com/office/word/2012/wordml" xmlns:w16cex="http://schemas.microsoft.com/office/word/2018/wordml/cex" xmlns:w16cid="http://schemas.microsoft.com/office/word/2016/wordml/cid" xmlns:w16="http://schemas.microsoft.com/office/word/2018/wordml" xmlns:w16du="http://schemas.microsoft.com/office/word/2023/wordml/word16du" xmlns:w16sdtdh="http://schemas.microsoft.com/office/word/2020/wordml/sdtdatahash" xmlns:w16sdtfl="http://schemas.microsoft.com/office/word/2024/wordml/sdtformatlock" xmlns:w16se="http://schemas.microsoft.com/office/word/2015/wordml/symex" xmlns:wpg="http://schemas.microsoft.com/office/word/2010/wordprocessingGroup" xmlns:wpi="http://schemas.microsoft.com/office/word/2010/wordprocessingInk" xmlns:wne="http://schemas.microsoft.com/office/word/2006/wordml" xmlns:wps="http://schemas.microsoft.com/office/word/2010/wordprocessingShape" mc:Ignorable="w14 w15 w16se w16cid w16 w16cex w16sdtdh w16sdtfl w16du wp14">
+<w:document xmlns:wpc="http://schemas.microsoft.com/office/word/2010/wordprocessingCanvas" xmlns:cx="http://schemas.microsoft.com/office/drawing/2014/chartex" xmlns:mc="http://schemas.openxmlformats.org/markup-compatibility/2006" xmlns:o="urn:schemas-microsoft-com:office:office" xmlns:r="http://schemas.openxmlformats.org/officeDocument/2006/relationships" xmlns:m="http://schemas.openxmlformats.org/officeDocument/2006/math" xmlns:v="urn:schemas-microsoft-com:vml" xmlns:wp14="http://schemas.microsoft.com/office/word/2010/wordprocessingDrawing" xmlns:wp="http://schemas.openxmlformats.org/drawingml/2006/wordprocessingDrawing" xmlns:w10="urn:schemas-microsoft-com:office:word" xmlns:w="http://schemas.openxmlformats.org/wordprocessingml/2006/main" xmlns:w14="http://schemas.microsoft.com/office/word/2010/wordml" xmlns:w15="http://schemas.microsoft.com/office/word/2012/wordml" xmlns:w16se="http://schemas.microsoft.com/office/word/2015/wordml/symex" xmlns:wpg="http://schemas.microsoft.com/office/word/2010/wordprocessingGroup" xmlns:wpi="http://schemas.microsoft.com/office/word/2010/wordprocessingInk" xmlns:wne="http://schemas.microsoft.com/office/word/2006/wordml" xmlns:wps="http://schemas.microsoft.com/office/word/2010/wordprocessingShape" mc:Ignorable="w14 w15 w16se wp14">
   <w:body>
     <w:p>
       <w:pPr>
@@ -168,7 +168,15 @@
       </w:r>
       <w:proofErr w:type="spellEnd"/>
       <w:r>
-        <w:t xml:space="preserve"> Forest encontré que cerca del 3% de los usuarios tiene un comportamiento raro — ritmos de consumo muy por encima del resto o calificaciones muy inconsistentes. Puede ser gente compartiendo cuenta o simplemente consumo extremo, pero conviene no mezclarlos con el resto al entrenar el </w:t>
+        <w:t xml:space="preserve"> </w:t>
+      </w:r>
+      <w:proofErr w:type="spellStart"/>
+      <w:r>
+        <w:t>Forest</w:t>
+      </w:r>
+      <w:proofErr w:type="spellEnd"/>
+      <w:r>
+        <w:t xml:space="preserve"> encontré que cerca del 3% de los usuarios tiene un comportamiento raro — ritmos de consumo muy por encima del resto o calificaciones muy inconsistentes. Puede ser gente compartiendo cuenta o simplemente consumo extremo, pero conviene no mezclarlos con el resto al entrenar el </w:t>
       </w:r>
       <w:proofErr w:type="spellStart"/>
       <w:r>
@@ -258,10 +266,7 @@
         <w:t xml:space="preserve"> se</w:t>
       </w:r>
       <w:r>
-        <w:t xml:space="preserve"> </w:t>
-      </w:r>
-      <w:r>
-        <w:t>prob</w:t>
+        <w:t xml:space="preserve"> prob</w:t>
       </w:r>
       <w:r>
         <w:t>ó</w:t>
@@ -1180,6 +1185,7 @@
           <w:noProof/>
           <w:sz w:val="24"/>
           <w:szCs w:val="24"/>
+          <w:lang w:eastAsia="es-EC"/>
         </w:rPr>
         <w:drawing>
           <wp:inline distT="0" distB="0" distL="0" distR="0" wp14:anchorId="70F3BE60" wp14:editId="51DB4B7B">
@@ -1725,26 +1731,41 @@
     </w:p>
     <w:p>
       <w:pPr>
+        <w:pStyle w:val="Ttulo2"/>
+      </w:pPr>
+      <w:r>
+        <w:t>8</w:t>
+      </w:r>
+      <w:r>
+        <w:t xml:space="preserve">. </w:t>
+      </w:r>
+      <w:r>
+        <w:t>Enlace de GitHub</w:t>
+      </w:r>
+    </w:p>
+    <w:p>
+      <w:pPr>
         <w:ind w:firstLine="0"/>
       </w:pPr>
-    </w:p>
-    <w:p>
-      <w:pPr>
-        <w:spacing w:after="100"/>
-        <w:rPr>
-          <w:rFonts w:ascii="Times New Roman" w:hAnsi="Times New Roman" w:cs="Times New Roman"/>
-          <w:sz w:val="24"/>
-          <w:szCs w:val="24"/>
-        </w:rPr>
-      </w:pPr>
-    </w:p>
-    <w:p>
-      <w:pPr>
-        <w:ind w:firstLine="0"/>
-      </w:pPr>
+      <w:hyperlink r:id="rId9" w:history="1">
+        <w:r>
+          <w:rPr>
+            <w:rStyle w:val="Hipervnculo"/>
+          </w:rPr>
+          <w:t>https://github.com/Alexander-Luna/MODULE_SUPERVISED</w:t>
+        </w:r>
+        <w:bookmarkStart w:id="0" w:name="_GoBack"/>
+        <w:bookmarkEnd w:id="0"/>
+        <w:r>
+          <w:rPr>
+            <w:rStyle w:val="Hipervnculo"/>
+          </w:rPr>
+          <w:t>_AND_UNSUPERVISED/blob/main/Semana%201/Entregable_Semana1_Attrition%20(2).ipynb</w:t>
+        </w:r>
+      </w:hyperlink>
     </w:p>
     <w:sectPr>
-      <w:headerReference w:type="default" r:id="rId9"/>
+      <w:headerReference w:type="default" r:id="rId10"/>
       <w:pgSz w:w="12240" w:h="15840"/>
       <w:pgMar w:top="1440" w:right="1440" w:bottom="1440" w:left="1440" w:header="709" w:footer="709" w:gutter="0"/>
       <w:cols w:space="708"/>
@@ -1755,7 +1776,7 @@
 </file>
 
 <file path=word/endnotes.xml><?xml version="1.0" encoding="utf-8"?>
-<w:endnotes xmlns:wpc="http://schemas.microsoft.com/office/word/2010/wordprocessingCanvas" xmlns:cx="http://schemas.microsoft.com/office/drawing/2014/chartex" xmlns:cx1="http://schemas.microsoft.com/office/drawing/2015/9/8/chartex" xmlns:cx2="http://schemas.microsoft.com/office/drawing/2015/10/21/chartex" xmlns:cx3="http://schemas.microsoft.com/office/drawing/2016/5/9/chartex" xmlns:cx4="http://schemas.microsoft.com/office/drawing/2016/5/10/chartex" xmlns:cx5="http://schemas.microsoft.com/office/drawing/2016/5/11/chartex" xmlns:cx6="http://schemas.microsoft.com/office/drawing/2016/5/12/chartex" xmlns:cx7="http://schemas.microsoft.com/office/drawing/2016/5/13/chartex" xmlns:cx8="http://schemas.microsoft.com/office/drawing/2016/5/14/chartex" xmlns:mc="http://schemas.openxmlformats.org/markup-compatibility/2006" xmlns:aink="http://schemas.microsoft.com/office/drawing/2016/ink" xmlns:am3d="http://schemas.microsoft.com/office/drawing/2017/model3d" xmlns:o="urn:schemas-microsoft-com:office:office" xmlns:oel="http://schemas.microsoft.com/office/2019/extlst" xmlns:r="http://schemas.openxmlformats.org/officeDocument/2006/relationships" xmlns:m="http://schemas.openxmlformats.org/officeDocument/2006/math" xmlns:v="urn:schemas-microsoft-com:vml" xmlns:wp14="http://schemas.microsoft.com/office/word/2010/wordprocessingDrawing" xmlns:wp="http://schemas.openxmlformats.org/drawingml/2006/wordprocessingDrawing" xmlns:w10="urn:schemas-microsoft-com:office:word" xmlns:w="http://schemas.openxmlformats.org/wordprocessingml/2006/main" xmlns:w14="http://schemas.microsoft.com/office/word/2010/wordml" xmlns:w15="http://schemas.microsoft.com/office/word/2012/wordml" xmlns:w16cex="http://schemas.microsoft.com/office/word/2018/wordml/cex" xmlns:w16cid="http://schemas.microsoft.com/office/word/2016/wordml/cid" xmlns:w16="http://schemas.microsoft.com/office/word/2018/wordml" xmlns:w16du="http://schemas.microsoft.com/office/word/2023/wordml/word16du" xmlns:w16sdtdh="http://schemas.microsoft.com/office/word/2020/wordml/sdtdatahash" xmlns:w16sdtfl="http://schemas.microsoft.com/office/word/2024/wordml/sdtformatlock" xmlns:w16se="http://schemas.microsoft.com/office/word/2015/wordml/symex" xmlns:wpg="http://schemas.microsoft.com/office/word/2010/wordprocessingGroup" xmlns:wpi="http://schemas.microsoft.com/office/word/2010/wordprocessingInk" xmlns:wne="http://schemas.microsoft.com/office/word/2006/wordml" xmlns:wps="http://schemas.microsoft.com/office/word/2010/wordprocessingShape" mc:Ignorable="w14 w15 w16se w16cid w16 w16cex w16sdtdh w16sdtfl w16du wp14">
+<w:endnotes xmlns:wpc="http://schemas.microsoft.com/office/word/2010/wordprocessingCanvas" xmlns:cx="http://schemas.microsoft.com/office/drawing/2014/chartex" xmlns:mc="http://schemas.openxmlformats.org/markup-compatibility/2006" xmlns:o="urn:schemas-microsoft-com:office:office" xmlns:r="http://schemas.openxmlformats.org/officeDocument/2006/relationships" xmlns:m="http://schemas.openxmlformats.org/officeDocument/2006/math" xmlns:v="urn:schemas-microsoft-com:vml" xmlns:wp14="http://schemas.microsoft.com/office/word/2010/wordprocessingDrawing" xmlns:wp="http://schemas.openxmlformats.org/drawingml/2006/wordprocessingDrawing" xmlns:w10="urn:schemas-microsoft-com:office:word" xmlns:w="http://schemas.openxmlformats.org/wordprocessingml/2006/main" xmlns:w14="http://schemas.microsoft.com/office/word/2010/wordml" xmlns:w15="http://schemas.microsoft.com/office/word/2012/wordml" xmlns:w16se="http://schemas.microsoft.com/office/word/2015/wordml/symex" xmlns:wpg="http://schemas.microsoft.com/office/word/2010/wordprocessingGroup" xmlns:wpi="http://schemas.microsoft.com/office/word/2010/wordprocessingInk" xmlns:wne="http://schemas.microsoft.com/office/word/2006/wordml" xmlns:wps="http://schemas.microsoft.com/office/word/2010/wordprocessingShape" mc:Ignorable="w14 w15 w16se wp14">
   <w:endnote w:type="separator" w:id="-1">
     <w:p>
       <w:pPr>
@@ -1780,7 +1801,7 @@
 </file>
 
 <file path=word/footnotes.xml><?xml version="1.0" encoding="utf-8"?>
-<w:footnotes xmlns:wpc="http://schemas.microsoft.com/office/word/2010/wordprocessingCanvas" xmlns:cx="http://schemas.microsoft.com/office/drawing/2014/chartex" xmlns:cx1="http://schemas.microsoft.com/office/drawing/2015/9/8/chartex" xmlns:cx2="http://schemas.microsoft.com/office/drawing/2015/10/21/chartex" xmlns:cx3="http://schemas.microsoft.com/office/drawing/2016/5/9/chartex" xmlns:cx4="http://schemas.microsoft.com/office/drawing/2016/5/10/chartex" xmlns:cx5="http://schemas.microsoft.com/office/drawing/2016/5/11/chartex" xmlns:cx6="http://schemas.microsoft.com/office/drawing/2016/5/12/chartex" xmlns:cx7="http://schemas.microsoft.com/office/drawing/2016/5/13/chartex" xmlns:cx8="http://schemas.microsoft.com/office/drawing/2016/5/14/chartex" xmlns:mc="http://schemas.openxmlformats.org/markup-compatibility/2006" xmlns:aink="http://schemas.microsoft.com/office/drawing/2016/ink" xmlns:am3d="http://schemas.microsoft.com/office/drawing/2017/model3d" xmlns:o="urn:schemas-microsoft-com:office:office" xmlns:oel="http://schemas.microsoft.com/office/2019/extlst" xmlns:r="http://schemas.openxmlformats.org/officeDocument/2006/relationships" xmlns:m="http://schemas.openxmlformats.org/officeDocument/2006/math" xmlns:v="urn:schemas-microsoft-com:vml" xmlns:wp14="http://schemas.microsoft.com/office/word/2010/wordprocessingDrawing" xmlns:wp="http://schemas.openxmlformats.org/drawingml/2006/wordprocessingDrawing" xmlns:w10="urn:schemas-microsoft-com:office:word" xmlns:w="http://schemas.openxmlformats.org/wordprocessingml/2006/main" xmlns:w14="http://schemas.microsoft.com/office/word/2010/wordml" xmlns:w15="http://schemas.microsoft.com/office/word/2012/wordml" xmlns:w16cex="http://schemas.microsoft.com/office/word/2018/wordml/cex" xmlns:w16cid="http://schemas.microsoft.com/office/word/2016/wordml/cid" xmlns:w16="http://schemas.microsoft.com/office/word/2018/wordml" xmlns:w16du="http://schemas.microsoft.com/office/word/2023/wordml/word16du" xmlns:w16sdtdh="http://schemas.microsoft.com/office/word/2020/wordml/sdtdatahash" xmlns:w16sdtfl="http://schemas.microsoft.com/office/word/2024/wordml/sdtformatlock" xmlns:w16se="http://schemas.microsoft.com/office/word/2015/wordml/symex" xmlns:wpg="http://schemas.microsoft.com/office/word/2010/wordprocessingGroup" xmlns:wpi="http://schemas.microsoft.com/office/word/2010/wordprocessingInk" xmlns:wne="http://schemas.microsoft.com/office/word/2006/wordml" xmlns:wps="http://schemas.microsoft.com/office/word/2010/wordprocessingShape" mc:Ignorable="w14 w15 w16se w16cid w16 w16cex w16sdtdh w16sdtfl w16du wp14">
+<w:footnotes xmlns:wpc="http://schemas.microsoft.com/office/word/2010/wordprocessingCanvas" xmlns:cx="http://schemas.microsoft.com/office/drawing/2014/chartex" xmlns:mc="http://schemas.openxmlformats.org/markup-compatibility/2006" xmlns:o="urn:schemas-microsoft-com:office:office" xmlns:r="http://schemas.openxmlformats.org/officeDocument/2006/relationships" xmlns:m="http://schemas.openxmlformats.org/officeDocument/2006/math" xmlns:v="urn:schemas-microsoft-com:vml" xmlns:wp14="http://schemas.microsoft.com/office/word/2010/wordprocessingDrawing" xmlns:wp="http://schemas.openxmlformats.org/drawingml/2006/wordprocessingDrawing" xmlns:w10="urn:schemas-microsoft-com:office:word" xmlns:w="http://schemas.openxmlformats.org/wordprocessingml/2006/main" xmlns:w14="http://schemas.microsoft.com/office/word/2010/wordml" xmlns:w15="http://schemas.microsoft.com/office/word/2012/wordml" xmlns:w16se="http://schemas.microsoft.com/office/word/2015/wordml/symex" xmlns:wpg="http://schemas.microsoft.com/office/word/2010/wordprocessingGroup" xmlns:wpi="http://schemas.microsoft.com/office/word/2010/wordprocessingInk" xmlns:wne="http://schemas.microsoft.com/office/word/2006/wordml" xmlns:wps="http://schemas.microsoft.com/office/word/2010/wordprocessingShape" mc:Ignorable="w14 w15 w16se wp14">
   <w:footnote w:type="separator" w:id="-1">
     <w:p>
       <w:pPr>
@@ -1805,7 +1826,7 @@
 </file>
 
 <file path=word/header1.xml><?xml version="1.0" encoding="utf-8"?>
-<w:hdr xmlns:wpc="http://schemas.microsoft.com/office/word/2010/wordprocessingCanvas" xmlns:cx="http://schemas.microsoft.com/office/drawing/2014/chartex" xmlns:cx1="http://schemas.microsoft.com/office/drawing/2015/9/8/chartex" xmlns:cx2="http://schemas.microsoft.com/office/drawing/2015/10/21/chartex" xmlns:cx3="http://schemas.microsoft.com/office/drawing/2016/5/9/chartex" xmlns:cx4="http://schemas.microsoft.com/office/drawing/2016/5/10/chartex" xmlns:cx5="http://schemas.microsoft.com/office/drawing/2016/5/11/chartex" xmlns:cx6="http://schemas.microsoft.com/office/drawing/2016/5/12/chartex" xmlns:cx7="http://schemas.microsoft.com/office/drawing/2016/5/13/chartex" xmlns:cx8="http://schemas.microsoft.com/office/drawing/2016/5/14/chartex" xmlns:mc="http://schemas.openxmlformats.org/markup-compatibility/2006" xmlns:aink="http://schemas.microsoft.com/office/drawing/2016/ink" xmlns:am3d="http://schemas.microsoft.com/office/drawing/2017/model3d" xmlns:o="urn:schemas-microsoft-com:office:office" xmlns:oel="http://schemas.microsoft.com/office/2019/extlst" xmlns:r="http://schemas.openxmlformats.org/officeDocument/2006/relationships" xmlns:m="http://schemas.openxmlformats.org/officeDocument/2006/math" xmlns:v="urn:schemas-microsoft-com:vml" xmlns:wp14="http://schemas.microsoft.com/office/word/2010/wordprocessingDrawing" xmlns:wp="http://schemas.openxmlformats.org/drawingml/2006/wordprocessingDrawing" xmlns:w10="urn:schemas-microsoft-com:office:word" xmlns:w="http://schemas.openxmlformats.org/wordprocessingml/2006/main" xmlns:w14="http://schemas.microsoft.com/office/word/2010/wordml" xmlns:w15="http://schemas.microsoft.com/office/word/2012/wordml" xmlns:w16cex="http://schemas.microsoft.com/office/word/2018/wordml/cex" xmlns:w16cid="http://schemas.microsoft.com/office/word/2016/wordml/cid" xmlns:w16="http://schemas.microsoft.com/office/word/2018/wordml" xmlns:w16du="http://schemas.microsoft.com/office/word/2023/wordml/word16du" xmlns:w16sdtdh="http://schemas.microsoft.com/office/word/2020/wordml/sdtdatahash" xmlns:w16sdtfl="http://schemas.microsoft.com/office/word/2024/wordml/sdtformatlock" xmlns:w16se="http://schemas.microsoft.com/office/word/2015/wordml/symex" xmlns:wpg="http://schemas.microsoft.com/office/word/2010/wordprocessingGroup" xmlns:wpi="http://schemas.microsoft.com/office/word/2010/wordprocessingInk" xmlns:wne="http://schemas.microsoft.com/office/word/2006/wordml" xmlns:wps="http://schemas.microsoft.com/office/word/2010/wordprocessingShape" mc:Ignorable="w14 w15 w16se w16cid w16 w16cex w16sdtdh w16sdtfl w16du wp14">
+<w:hdr xmlns:wpc="http://schemas.microsoft.com/office/word/2010/wordprocessingCanvas" xmlns:cx="http://schemas.microsoft.com/office/drawing/2014/chartex" xmlns:mc="http://schemas.openxmlformats.org/markup-compatibility/2006" xmlns:o="urn:schemas-microsoft-com:office:office" xmlns:r="http://schemas.openxmlformats.org/officeDocument/2006/relationships" xmlns:m="http://schemas.openxmlformats.org/officeDocument/2006/math" xmlns:v="urn:schemas-microsoft-com:vml" xmlns:wp14="http://schemas.microsoft.com/office/word/2010/wordprocessingDrawing" xmlns:wp="http://schemas.openxmlformats.org/drawingml/2006/wordprocessingDrawing" xmlns:w10="urn:schemas-microsoft-com:office:word" xmlns:w="http://schemas.openxmlformats.org/wordprocessingml/2006/main" xmlns:w14="http://schemas.microsoft.com/office/word/2010/wordml" xmlns:w15="http://schemas.microsoft.com/office/word/2012/wordml" xmlns:w16se="http://schemas.microsoft.com/office/word/2015/wordml/symex" xmlns:wpg="http://schemas.microsoft.com/office/word/2010/wordprocessingGroup" xmlns:wpi="http://schemas.microsoft.com/office/word/2010/wordprocessingInk" xmlns:wne="http://schemas.microsoft.com/office/word/2006/wordml" xmlns:wps="http://schemas.microsoft.com/office/word/2010/wordprocessingShape" mc:Ignorable="w14 w15 w16se wp14">
   <w:sdt>
     <w:sdtPr>
       <w:id w:val="372121458"/>
@@ -1832,9 +1853,10 @@
         </w:r>
         <w:r>
           <w:rPr>
+            <w:noProof/>
             <w:lang w:val="es-ES"/>
           </w:rPr>
-          <w:t>2</w:t>
+          <w:t>4</w:t>
         </w:r>
         <w:r>
           <w:fldChar w:fldCharType="end"/>
@@ -1852,7 +1874,7 @@
 </file>
 
 <file path=word/numbering.xml><?xml version="1.0" encoding="utf-8"?>
-<w:numbering xmlns:wpc="http://schemas.microsoft.com/office/word/2010/wordprocessingCanvas" xmlns:cx="http://schemas.microsoft.com/office/drawing/2014/chartex" xmlns:cx1="http://schemas.microsoft.com/office/drawing/2015/9/8/chartex" xmlns:cx2="http://schemas.microsoft.com/office/drawing/2015/10/21/chartex" xmlns:cx3="http://schemas.microsoft.com/office/drawing/2016/5/9/chartex" xmlns:cx4="http://schemas.microsoft.com/office/drawing/2016/5/10/chartex" xmlns:cx5="http://schemas.microsoft.com/office/drawing/2016/5/11/chartex" xmlns:cx6="http://schemas.microsoft.com/office/drawing/2016/5/12/chartex" xmlns:cx7="http://schemas.microsoft.com/office/drawing/2016/5/13/chartex" xmlns:cx8="http://schemas.microsoft.com/office/drawing/2016/5/14/chartex" xmlns:mc="http://schemas.openxmlformats.org/markup-compatibility/2006" xmlns:aink="http://schemas.microsoft.com/office/drawing/2016/ink" xmlns:am3d="http://schemas.microsoft.com/office/drawing/2017/model3d" xmlns:o="urn:schemas-microsoft-com:office:office" xmlns:oel="http://schemas.microsoft.com/office/2019/extlst" xmlns:r="http://schemas.openxmlformats.org/officeDocument/2006/relationships" xmlns:m="http://schemas.openxmlformats.org/officeDocument/2006/math" xmlns:v="urn:schemas-microsoft-com:vml" xmlns:wp14="http://schemas.microsoft.com/office/word/2010/wordprocessingDrawing" xmlns:wp="http://schemas.openxmlformats.org/drawingml/2006/wordprocessingDrawing" xmlns:w10="urn:schemas-microsoft-com:office:word" xmlns:w="http://schemas.openxmlformats.org/wordprocessingml/2006/main" xmlns:w14="http://schemas.microsoft.com/office/word/2010/wordml" xmlns:w15="http://schemas.microsoft.com/office/word/2012/wordml" xmlns:w16cex="http://schemas.microsoft.com/office/word/2018/wordml/cex" xmlns:w16cid="http://schemas.microsoft.com/office/word/2016/wordml/cid" xmlns:w16="http://schemas.microsoft.com/office/word/2018/wordml" xmlns:w16du="http://schemas.microsoft.com/office/word/2023/wordml/word16du" xmlns:w16sdtdh="http://schemas.microsoft.com/office/word/2020/wordml/sdtdatahash" xmlns:w16sdtfl="http://schemas.microsoft.com/office/word/2024/wordml/sdtformatlock" xmlns:w16se="http://schemas.microsoft.com/office/word/2015/wordml/symex" xmlns:wpg="http://schemas.microsoft.com/office/word/2010/wordprocessingGroup" xmlns:wpi="http://schemas.microsoft.com/office/word/2010/wordprocessingInk" xmlns:wne="http://schemas.microsoft.com/office/word/2006/wordml" xmlns:wps="http://schemas.microsoft.com/office/word/2010/wordprocessingShape" mc:Ignorable="w14 w15 w16se w16cid w16 w16cex w16sdtdh w16sdtfl w16du wp14">
+<w:numbering xmlns:wpc="http://schemas.microsoft.com/office/word/2010/wordprocessingCanvas" xmlns:cx="http://schemas.microsoft.com/office/drawing/2014/chartex" xmlns:mc="http://schemas.openxmlformats.org/markup-compatibility/2006" xmlns:o="urn:schemas-microsoft-com:office:office" xmlns:r="http://schemas.openxmlformats.org/officeDocument/2006/relationships" xmlns:m="http://schemas.openxmlformats.org/officeDocument/2006/math" xmlns:v="urn:schemas-microsoft-com:vml" xmlns:wp14="http://schemas.microsoft.com/office/word/2010/wordprocessingDrawing" xmlns:wp="http://schemas.openxmlformats.org/drawingml/2006/wordprocessingDrawing" xmlns:w10="urn:schemas-microsoft-com:office:word" xmlns:w="http://schemas.openxmlformats.org/wordprocessingml/2006/main" xmlns:w14="http://schemas.microsoft.com/office/word/2010/wordml" xmlns:w15="http://schemas.microsoft.com/office/word/2012/wordml" xmlns:w16se="http://schemas.microsoft.com/office/word/2015/wordml/symex" xmlns:wpg="http://schemas.microsoft.com/office/word/2010/wordprocessingGroup" xmlns:wpi="http://schemas.microsoft.com/office/word/2010/wordprocessingInk" xmlns:wne="http://schemas.microsoft.com/office/word/2006/wordml" xmlns:wps="http://schemas.microsoft.com/office/word/2010/wordprocessingShape" mc:Ignorable="w14 w15 w16se wp14">
   <w:abstractNum w:abstractNumId="0" w15:restartNumberingAfterBreak="0">
     <w:nsid w:val="001555AD"/>
     <w:multiLevelType w:val="hybridMultilevel"/>
@@ -2730,38 +2752,38 @@
       </w:rPr>
     </w:lvl>
   </w:abstractNum>
-  <w:num w:numId="1" w16cid:durableId="697315105">
+  <w:num w:numId="1">
     <w:abstractNumId w:val="6"/>
   </w:num>
-  <w:num w:numId="2" w16cid:durableId="1116218309">
+  <w:num w:numId="2">
     <w:abstractNumId w:val="7"/>
   </w:num>
-  <w:num w:numId="3" w16cid:durableId="1522206464">
+  <w:num w:numId="3">
     <w:abstractNumId w:val="1"/>
   </w:num>
-  <w:num w:numId="4" w16cid:durableId="1112555688">
+  <w:num w:numId="4">
     <w:abstractNumId w:val="3"/>
     <w:lvlOverride w:ilvl="0">
       <w:startOverride w:val="1"/>
     </w:lvlOverride>
   </w:num>
-  <w:num w:numId="5" w16cid:durableId="644239496">
+  <w:num w:numId="5">
     <w:abstractNumId w:val="2"/>
   </w:num>
-  <w:num w:numId="6" w16cid:durableId="453864037">
+  <w:num w:numId="6">
     <w:abstractNumId w:val="0"/>
   </w:num>
-  <w:num w:numId="7" w16cid:durableId="2119399847">
+  <w:num w:numId="7">
     <w:abstractNumId w:val="4"/>
   </w:num>
-  <w:num w:numId="8" w16cid:durableId="370888951">
+  <w:num w:numId="8">
     <w:abstractNumId w:val="5"/>
   </w:num>
 </w:numbering>
 </file>
 
 <file path=word/styles.xml><?xml version="1.0" encoding="utf-8"?>
-<w:styles xmlns:mc="http://schemas.openxmlformats.org/markup-compatibility/2006" xmlns:r="http://schemas.openxmlformats.org/officeDocument/2006/relationships" xmlns:w="http://schemas.openxmlformats.org/wordprocessingml/2006/main" xmlns:w14="http://schemas.microsoft.com/office/word/2010/wordml" xmlns:w15="http://schemas.microsoft.com/office/word/2012/wordml" xmlns:w16cex="http://schemas.microsoft.com/office/word/2018/wordml/cex" xmlns:w16cid="http://schemas.microsoft.com/office/word/2016/wordml/cid" xmlns:w16="http://schemas.microsoft.com/office/word/2018/wordml" xmlns:w16du="http://schemas.microsoft.com/office/word/2023/wordml/word16du" xmlns:w16sdtdh="http://schemas.microsoft.com/office/word/2020/wordml/sdtdatahash" xmlns:w16sdtfl="http://schemas.microsoft.com/office/word/2024/wordml/sdtformatlock" xmlns:w16se="http://schemas.microsoft.com/office/word/2015/wordml/symex" mc:Ignorable="w14 w15 w16se w16cid w16 w16cex w16sdtdh w16sdtfl w16du">
+<w:styles xmlns:mc="http://schemas.openxmlformats.org/markup-compatibility/2006" xmlns:r="http://schemas.openxmlformats.org/officeDocument/2006/relationships" xmlns:w="http://schemas.openxmlformats.org/wordprocessingml/2006/main" xmlns:w14="http://schemas.microsoft.com/office/word/2010/wordml" xmlns:w15="http://schemas.microsoft.com/office/word/2012/wordml" xmlns:w16se="http://schemas.microsoft.com/office/word/2015/wordml/symex" mc:Ignorable="w14 w15 w16se">
   <w:docDefaults>
     <w:rPrDefault>
       <w:rPr>
@@ -2777,7 +2799,7 @@
       </w:pPr>
     </w:pPrDefault>
   </w:docDefaults>
-  <w:latentStyles w:defLockedState="0" w:defUIPriority="99" w:defSemiHidden="0" w:defUnhideWhenUsed="0" w:defQFormat="0" w:count="376">
+  <w:latentStyles w:defLockedState="0" w:defUIPriority="99" w:defSemiHidden="0" w:defUnhideWhenUsed="0" w:defQFormat="0" w:count="371">
     <w:lsdException w:name="Normal" w:uiPriority="0" w:qFormat="1"/>
     <w:lsdException w:name="heading 1" w:uiPriority="9" w:qFormat="1"/>
     <w:lsdException w:name="heading 2" w:semiHidden="1" w:uiPriority="9" w:unhideWhenUsed="1" w:qFormat="1"/>
@@ -3149,11 +3171,6 @@
     <w:lsdException w:name="List Table 5 Dark Accent 6" w:uiPriority="50"/>
     <w:lsdException w:name="List Table 6 Colorful Accent 6" w:uiPriority="51"/>
     <w:lsdException w:name="List Table 7 Colorful Accent 6" w:uiPriority="52"/>
-    <w:lsdException w:name="Mention" w:semiHidden="1" w:unhideWhenUsed="1"/>
-    <w:lsdException w:name="Smart Hyperlink" w:semiHidden="1" w:unhideWhenUsed="1"/>
-    <w:lsdException w:name="Hashtag" w:semiHidden="1" w:unhideWhenUsed="1"/>
-    <w:lsdException w:name="Unresolved Mention" w:semiHidden="1" w:unhideWhenUsed="1"/>
-    <w:lsdException w:name="Smart Link" w:semiHidden="1" w:unhideWhenUsed="1"/>
   </w:latentStyles>
   <w:style w:type="paragraph" w:default="1" w:styleId="Normal">
     <w:name w:val="Normal"/>
@@ -3256,6 +3273,7 @@
   <w:style w:type="character" w:default="1" w:styleId="Fuentedeprrafopredeter">
     <w:name w:val="Default Paragraph Font"/>
     <w:uiPriority w:val="1"/>
+    <w:semiHidden/>
     <w:unhideWhenUsed/>
   </w:style>
   <w:style w:type="table" w:default="1" w:styleId="Tablanormal">
@@ -3634,7 +3652,7 @@
       </w:tcPr>
     </w:tblStylePr>
   </w:style>
-  <w:style w:type="character" w:styleId="Mencinsinresolver">
+  <w:style w:type="character" w:customStyle="1" w:styleId="UnresolvedMention">
     <w:name w:val="Unresolved Mention"/>
     <w:basedOn w:val="Fuentedeprrafopredeter"/>
     <w:uiPriority w:val="99"/>
@@ -4132,7 +4150,7 @@
 </file>
 
 <file path=customXml/itemProps1.xml><?xml version="1.0" encoding="utf-8"?>
-<ds:datastoreItem xmlns:ds="http://schemas.openxmlformats.org/officeDocument/2006/customXml" ds:itemID="{F7C1F402-88A2-40D0-A802-7CEBA8973D92}">
+<ds:datastoreItem xmlns:ds="http://schemas.openxmlformats.org/officeDocument/2006/customXml" ds:itemID="{E37186B1-2A2C-48EE-9E2E-BA4D28AC30F2}">
   <ds:schemaRefs>
     <ds:schemaRef ds:uri="http://schemas.openxmlformats.org/officeDocument/2006/bibliography"/>
   </ds:schemaRefs>

</xml_diff>